<commit_message>
Update portfolio to reflect Software Engineer title and focus on web development
</commit_message>
<xml_diff>
--- a/src/assets/DANIEL OBIEFULE - CV.docx
+++ b/src/assets/DANIEL OBIEFULE - CV.docx
@@ -142,35 +142,7 @@
         <w:rPr>
           <w:color w:val="000000" w:themeColor="text1"/>
         </w:rPr>
-        <w:t xml:space="preserve">Web Developer specializing in SEO-friendly WordPress, </w:t>
-      </w:r>
-      <w:proofErr w:type="spellStart"/>
-      <w:r>
-        <w:rPr>
-          <w:color w:val="000000" w:themeColor="text1"/>
-        </w:rPr>
-        <w:t>Elementor</w:t>
-      </w:r>
-      <w:proofErr w:type="spellEnd"/>
-      <w:r>
-        <w:rPr>
-          <w:color w:val="000000" w:themeColor="text1"/>
-        </w:rPr>
-        <w:t xml:space="preserve">, and WooCommerce websites, plus </w:t>
-      </w:r>
-      <w:proofErr w:type="spellStart"/>
-      <w:r>
-        <w:rPr>
-          <w:color w:val="000000" w:themeColor="text1"/>
-        </w:rPr>
-        <w:t>GoHighLevel</w:t>
-      </w:r>
-      <w:proofErr w:type="spellEnd"/>
-      <w:r>
-        <w:rPr>
-          <w:color w:val="000000" w:themeColor="text1"/>
-        </w:rPr>
-        <w:t xml:space="preserve"> funnels &amp; CRM automation. Delivered 15+ client sites, including Fillin (formerly Engen Mauritius), the Artemis Hospitals Mauritius network, and Prime Pillar Group, spanning healthcare, real estate, hospitality, and retail.</w:t>
+        <w:t>Software Engineer focused on web development, building SEO-friendly WordPress, Elementor, and WooCommerce websites, plus GoHighLevel funnels &amp; CRM automation. Delivered 15+ client sites, including Fillin (formerly Engen Mauritius), the Artemis Hospitals Mauritius network, and Prime Pillar Group, spanning healthcare, real estate, hospitality, and retail.</w:t>
       </w:r>
     </w:p>
     <w:tbl>
@@ -331,41 +303,13 @@
               <w:rPr>
                 <w:color w:val="000000" w:themeColor="text1"/>
               </w:rPr>
-              <w:t>Built and launched WordPress/</w:t>
-            </w:r>
-            <w:proofErr w:type="spellStart"/>
-            <w:r>
-              <w:rPr>
-                <w:color w:val="000000" w:themeColor="text1"/>
-              </w:rPr>
-              <w:t>Elementor</w:t>
-            </w:r>
-            <w:proofErr w:type="spellEnd"/>
-            <w:r>
-              <w:rPr>
-                <w:color w:val="000000" w:themeColor="text1"/>
-              </w:rPr>
-              <w:t xml:space="preserve"> websites for clients including Fillin (formerly Engen Mauritius) and the Artemis Hospitals Mauritius network, from custom theme and plugin development (PHP) through deployment</w:t>
-            </w:r>
-            <w:r>
-              <w:rPr>
-                <w:color w:val="000000" w:themeColor="text1"/>
-              </w:rPr>
-              <w:t xml:space="preserve"> </w:t>
-            </w:r>
-            <w:proofErr w:type="gramStart"/>
-            <w:r>
-              <w:rPr>
-                <w:color w:val="000000" w:themeColor="text1"/>
-              </w:rPr>
-              <w:t>( see</w:t>
-            </w:r>
-            <w:proofErr w:type="gramEnd"/>
-            <w:r>
-              <w:rPr>
-                <w:color w:val="000000" w:themeColor="text1"/>
-              </w:rPr>
-              <w:t xml:space="preserve"> portfolio - </w:t>
+              <w:t>Built and launched WordPress/Elementor websites for clients including Fillin (formerly Engen Mauritius) and the Artemis Hospitals Mauritius network, from custom theme and plugin development (PHP) through deployment</w:t>
+            </w:r>
+            <w:r>
+              <w:rPr>
+                <w:color w:val="000000" w:themeColor="text1"/>
+              </w:rPr>
+              <w:t xml:space="preserve"> ( see portfolio - </w:t>
             </w:r>
             <w:hyperlink r:id="rId12" w:history="1">
               <w:r>
@@ -397,21 +341,7 @@
               <w:rPr>
                 <w:color w:val="000000" w:themeColor="text1"/>
               </w:rPr>
-              <w:t xml:space="preserve">Built CRM pipelines and automated nurture sequences on </w:t>
-            </w:r>
-            <w:proofErr w:type="spellStart"/>
-            <w:r>
-              <w:rPr>
-                <w:color w:val="000000" w:themeColor="text1"/>
-              </w:rPr>
-              <w:t>GoHighLevel</w:t>
-            </w:r>
-            <w:proofErr w:type="spellEnd"/>
-            <w:r>
-              <w:rPr>
-                <w:color w:val="000000" w:themeColor="text1"/>
-              </w:rPr>
-              <w:t xml:space="preserve"> for clients including Lifetime Immigrations and Lifetime Resettlement Services.</w:t>
+              <w:t>Built CRM pipelines and automated nurture sequences on GoHighLevel for clients including Lifetime Immigrations and Lifetime Resettlement Services.</w:t>
             </w:r>
           </w:p>
           <w:p>
@@ -466,21 +396,7 @@
               <w:rPr>
                 <w:color w:val="000000" w:themeColor="text1"/>
               </w:rPr>
-              <w:t xml:space="preserve">Diagnosed and resolved WordPress and </w:t>
-            </w:r>
-            <w:proofErr w:type="spellStart"/>
-            <w:r>
-              <w:rPr>
-                <w:color w:val="000000" w:themeColor="text1"/>
-              </w:rPr>
-              <w:t>GoHighLevel</w:t>
-            </w:r>
-            <w:proofErr w:type="spellEnd"/>
-            <w:r>
-              <w:rPr>
-                <w:color w:val="000000" w:themeColor="text1"/>
-              </w:rPr>
-              <w:t xml:space="preserve"> issues, including broken funnels, plugin conflicts, and tracking errors, through ongoing client support.</w:t>
+              <w:t>Diagnosed and resolved WordPress and GoHighLevel issues, including broken funnels, plugin conflicts, and tracking errors, through ongoing client support.</w:t>
             </w:r>
           </w:p>
           <w:p>
@@ -508,19 +424,11 @@
               </w:rPr>
               <w:t xml:space="preserve"> | </w:t>
             </w:r>
-            <w:proofErr w:type="spellStart"/>
-            <w:r>
-              <w:rPr>
-                <w:color w:val="000000" w:themeColor="text1"/>
-              </w:rPr>
-              <w:t>eProcess</w:t>
-            </w:r>
-            <w:proofErr w:type="spellEnd"/>
-            <w:r>
-              <w:rPr>
-                <w:color w:val="000000" w:themeColor="text1"/>
-              </w:rPr>
-              <w:t xml:space="preserve"> Consulting Limited</w:t>
+            <w:r>
+              <w:rPr>
+                <w:color w:val="000000" w:themeColor="text1"/>
+              </w:rPr>
+              <w:t>eProcess Consulting Limited</w:t>
             </w:r>
             <w:r>
               <w:rPr>
@@ -688,21 +596,7 @@
               <w:rPr>
                 <w:color w:val="000000" w:themeColor="text1"/>
               </w:rPr>
-              <w:t xml:space="preserve"> | </w:t>
-            </w:r>
-            <w:proofErr w:type="spellStart"/>
-            <w:r>
-              <w:rPr>
-                <w:color w:val="000000" w:themeColor="text1"/>
-              </w:rPr>
-              <w:t>Elementor</w:t>
-            </w:r>
-            <w:proofErr w:type="spellEnd"/>
-            <w:r>
-              <w:rPr>
-                <w:color w:val="000000" w:themeColor="text1"/>
-              </w:rPr>
-              <w:t xml:space="preserve"> | Thrive Architect</w:t>
+              <w:t xml:space="preserve"> | Elementor | Thrive Architect</w:t>
             </w:r>
           </w:p>
           <w:p>
@@ -712,19 +606,11 @@
                 <w:color w:val="000000" w:themeColor="text1"/>
               </w:rPr>
             </w:pPr>
-            <w:proofErr w:type="spellStart"/>
-            <w:r>
-              <w:rPr>
-                <w:color w:val="000000" w:themeColor="text1"/>
-              </w:rPr>
-              <w:t>GoHighLevel</w:t>
-            </w:r>
-            <w:proofErr w:type="spellEnd"/>
-            <w:r>
-              <w:rPr>
-                <w:color w:val="000000" w:themeColor="text1"/>
-              </w:rPr>
-              <w:t xml:space="preserve"> | Zapier</w:t>
+            <w:r>
+              <w:rPr>
+                <w:color w:val="000000" w:themeColor="text1"/>
+              </w:rPr>
+              <w:t>GoHighLevel | Zapier</w:t>
             </w:r>
           </w:p>
         </w:tc>
@@ -960,7 +846,7 @@
     <w:sectPr>
       <w:type w:val="continuous"/>
       <w:pgSz w:w="12240" w:h="15840"/>
-      <w:pgMar w:top="907" w:right="1080" w:bottom="288" w:left="1080" w:header="720" w:footer="144" w:gutter="0"/>
+      <w:pgMar w:top="520" w:right="1080" w:bottom="288" w:left="1080" w:header="720" w:footer="144" w:gutter="0"/>
       <w:cols w:space="720"/>
       <w:docGrid w:linePitch="360"/>
     </w:sectPr>
@@ -2923,35 +2809,6 @@
 </file>
 
 <file path=customXml/item1.xml><?xml version="1.0" encoding="utf-8"?>
-<p:properties xmlns:p="http://schemas.microsoft.com/office/2006/metadata/properties" xmlns:xsi="http://www.w3.org/2001/XMLSchema-instance" xmlns:pc="http://schemas.microsoft.com/office/infopath/2007/PartnerControls">
-  <documentManagement>
-    <_ip_UnifiedCompliancePolicyUIAction xmlns="http://schemas.microsoft.com/sharepoint/v3" xsi:nil="true"/>
-    <Image xmlns="71af3243-3dd4-4a8d-8c0d-dd76da1f02a5">
-      <Url xsi:nil="true"/>
-      <Description xsi:nil="true"/>
-    </Image>
-    <Status xmlns="71af3243-3dd4-4a8d-8c0d-dd76da1f02a5">Not started</Status>
-    <Background xmlns="71af3243-3dd4-4a8d-8c0d-dd76da1f02a5">false</Background>
-    <_ip_UnifiedCompliancePolicyProperties xmlns="http://schemas.microsoft.com/sharepoint/v3" xsi:nil="true"/>
-    <ImageTagsTaxHTField xmlns="71af3243-3dd4-4a8d-8c0d-dd76da1f02a5">
-      <Terms xmlns="http://schemas.microsoft.com/office/infopath/2007/PartnerControls"/>
-    </ImageTagsTaxHTField>
-    <TaxCatchAll xmlns="230e9df3-be65-4c73-a93b-d1236ebd677e" xsi:nil="true"/>
-    <MediaServiceKeyPoints xmlns="71af3243-3dd4-4a8d-8c0d-dd76da1f02a5" xsi:nil="true"/>
-  </documentManagement>
-</p:properties>
-</file>
-
-<file path=customXml/item2.xml><?xml version="1.0" encoding="utf-8"?>
-<?mso-contentType ?>
-<FormTemplates xmlns="http://schemas.microsoft.com/sharepoint/v3/contenttype/forms">
-  <Display>DocumentLibraryForm</Display>
-  <Edit>DocumentLibraryForm</Edit>
-  <New>DocumentLibraryForm</New>
-</FormTemplates>
-</file>
-
-<file path=customXml/item3.xml><?xml version="1.0" encoding="utf-8"?>
 <ct:contentTypeSchema xmlns:ct="http://schemas.microsoft.com/office/2006/metadata/contentType" xmlns:ma="http://schemas.microsoft.com/office/2006/metadata/properties/metaAttributes" ct:_="" ma:_="" ma:contentTypeName="Document" ma:contentTypeID="0x01010079F111ED35F8CC479449609E8A0923A6" ma:contentTypeVersion="28" ma:contentTypeDescription="Create a new document." ma:contentTypeScope="" ma:versionID="60f5a4f2d2b0abadcf532d48ebf9cb71">
   <xsd:schema xmlns:xsd="http://www.w3.org/2001/XMLSchema" xmlns:xs="http://www.w3.org/2001/XMLSchema" xmlns:p="http://schemas.microsoft.com/office/2006/metadata/properties" xmlns:ns1="http://schemas.microsoft.com/sharepoint/v3" xmlns:ns2="71af3243-3dd4-4a8d-8c0d-dd76da1f02a5" xmlns:ns3="16c05727-aa75-4e4a-9b5f-8a80a1165891" xmlns:ns4="230e9df3-be65-4c73-a93b-d1236ebd677e" targetNamespace="http://schemas.microsoft.com/office/2006/metadata/properties" ma:root="true" ma:fieldsID="7dd78129e6a1811f84807ad11c651531" ns1:_="" ns2:_="" ns3:_="" ns4:_="">
     <xsd:import namespace="http://schemas.microsoft.com/sharepoint/v3"/>
@@ -3263,27 +3120,36 @@
 </ct:contentTypeSchema>
 </file>
 
-<file path=customXml/itemProps1.xml><?xml version="1.0" encoding="utf-8"?>
-<ds:datastoreItem xmlns:ds="http://schemas.openxmlformats.org/officeDocument/2006/customXml" ds:itemID="{7F2D81D4-B181-4590-A346-C3D62446712C}">
-  <ds:schemaRefs>
-    <ds:schemaRef ds:uri="http://schemas.microsoft.com/office/2006/metadata/properties"/>
-    <ds:schemaRef ds:uri="http://schemas.microsoft.com/office/infopath/2007/PartnerControls"/>
-    <ds:schemaRef ds:uri="http://schemas.microsoft.com/sharepoint/v3"/>
-    <ds:schemaRef ds:uri="71af3243-3dd4-4a8d-8c0d-dd76da1f02a5"/>
-    <ds:schemaRef ds:uri="230e9df3-be65-4c73-a93b-d1236ebd677e"/>
-  </ds:schemaRefs>
-</ds:datastoreItem>
+<file path=customXml/item2.xml><?xml version="1.0" encoding="utf-8"?>
+<?mso-contentType ?>
+<FormTemplates xmlns="http://schemas.microsoft.com/sharepoint/v3/contenttype/forms">
+  <Display>DocumentLibraryForm</Display>
+  <Edit>DocumentLibraryForm</Edit>
+  <New>DocumentLibraryForm</New>
+</FormTemplates>
 </file>
 
-<file path=customXml/itemProps2.xml><?xml version="1.0" encoding="utf-8"?>
-<ds:datastoreItem xmlns:ds="http://schemas.openxmlformats.org/officeDocument/2006/customXml" ds:itemID="{A726C3C3-1FC3-4E9F-9B06-85E0A0E4B2D3}">
-  <ds:schemaRefs>
-    <ds:schemaRef ds:uri="http://schemas.microsoft.com/sharepoint/v3/contenttype/forms"/>
-  </ds:schemaRefs>
-</ds:datastoreItem>
+<file path=customXml/item3.xml><?xml version="1.0" encoding="utf-8"?>
+<p:properties xmlns:p="http://schemas.microsoft.com/office/2006/metadata/properties" xmlns:xsi="http://www.w3.org/2001/XMLSchema-instance" xmlns:pc="http://schemas.microsoft.com/office/infopath/2007/PartnerControls">
+  <documentManagement>
+    <_ip_UnifiedCompliancePolicyUIAction xmlns="http://schemas.microsoft.com/sharepoint/v3" xsi:nil="true"/>
+    <Image xmlns="71af3243-3dd4-4a8d-8c0d-dd76da1f02a5">
+      <Url xsi:nil="true"/>
+      <Description xsi:nil="true"/>
+    </Image>
+    <Status xmlns="71af3243-3dd4-4a8d-8c0d-dd76da1f02a5">Not started</Status>
+    <Background xmlns="71af3243-3dd4-4a8d-8c0d-dd76da1f02a5">false</Background>
+    <_ip_UnifiedCompliancePolicyProperties xmlns="http://schemas.microsoft.com/sharepoint/v3" xsi:nil="true"/>
+    <ImageTagsTaxHTField xmlns="71af3243-3dd4-4a8d-8c0d-dd76da1f02a5">
+      <Terms xmlns="http://schemas.microsoft.com/office/infopath/2007/PartnerControls"/>
+    </ImageTagsTaxHTField>
+    <TaxCatchAll xmlns="230e9df3-be65-4c73-a93b-d1236ebd677e" xsi:nil="true"/>
+    <MediaServiceKeyPoints xmlns="71af3243-3dd4-4a8d-8c0d-dd76da1f02a5" xsi:nil="true"/>
+  </documentManagement>
+</p:properties>
 </file>
 
-<file path=customXml/itemProps3.xml><?xml version="1.0" encoding="utf-8"?>
+<file path=customXml/itemProps1.xml><?xml version="1.0" encoding="utf-8"?>
 <ds:datastoreItem xmlns:ds="http://schemas.openxmlformats.org/officeDocument/2006/customXml" ds:itemID="{812C4892-4E56-4599-B1CA-3C4D883B5246}">
   <ds:schemaRefs>
     <ds:schemaRef ds:uri="http://schemas.microsoft.com/office/2006/metadata/contentType"/>
@@ -3304,6 +3170,26 @@
 </ds:datastoreItem>
 </file>
 
+<file path=customXml/itemProps2.xml><?xml version="1.0" encoding="utf-8"?>
+<ds:datastoreItem xmlns:ds="http://schemas.openxmlformats.org/officeDocument/2006/customXml" ds:itemID="{A726C3C3-1FC3-4E9F-9B06-85E0A0E4B2D3}">
+  <ds:schemaRefs>
+    <ds:schemaRef ds:uri="http://schemas.microsoft.com/sharepoint/v3/contenttype/forms"/>
+  </ds:schemaRefs>
+</ds:datastoreItem>
+</file>
+
+<file path=customXml/itemProps3.xml><?xml version="1.0" encoding="utf-8"?>
+<ds:datastoreItem xmlns:ds="http://schemas.openxmlformats.org/officeDocument/2006/customXml" ds:itemID="{7F2D81D4-B181-4590-A346-C3D62446712C}">
+  <ds:schemaRefs>
+    <ds:schemaRef ds:uri="http://schemas.microsoft.com/office/2006/metadata/properties"/>
+    <ds:schemaRef ds:uri="http://schemas.microsoft.com/office/infopath/2007/PartnerControls"/>
+    <ds:schemaRef ds:uri="http://schemas.microsoft.com/sharepoint/v3"/>
+    <ds:schemaRef ds:uri="71af3243-3dd4-4a8d-8c0d-dd76da1f02a5"/>
+    <ds:schemaRef ds:uri="230e9df3-be65-4c73-a93b-d1236ebd677e"/>
+  </ds:schemaRefs>
+</ds:datastoreItem>
+</file>
+
 <file path=docMetadata/LabelInfo.xml><?xml version="1.0" encoding="utf-8"?>
 <clbl:labelList xmlns:clbl="http://schemas.microsoft.com/office/2020/mipLabelMetadata"/>
 </file>
</xml_diff>